<commit_message>
docs & config: update project references with new Vercel production URL
</commit_message>
<xml_diff>
--- a/Smart_Restaurant_Comprehensive_Technical_Report.docx
+++ b/Smart_Restaurant_Comprehensive_Technical_Report.docx
@@ -220,7 +220,7 @@
                 <w:sz w:val="19"/>
                 <w:szCs w:val="19"/>
               </w:rPr>
-              <w:t xml:space="preserve">Core Technology Stack</w:t>
+              <w:t xml:space="preserve">Live Vercel Production URL</w:t>
             </w:r>
           </w:p>
         </w:tc>
@@ -252,7 +252,7 @@
                 <w:sz w:val="19"/>
                 <w:szCs w:val="19"/>
               </w:rPr>
-              <w:t xml:space="preserve">React 18, TypeScript, Vite, Tailwind CSS, Three.js, WebXR, Google Model-Viewer</w:t>
+              <w:t xml:space="preserve">https://smart-restaurant-2za8.vercel.app/</w:t>
             </w:r>
           </w:p>
         </w:tc>
@@ -286,7 +286,7 @@
                 <w:sz w:val="19"/>
                 <w:szCs w:val="19"/>
               </w:rPr>
-              <w:t xml:space="preserve">Repository</w:t>
+              <w:t xml:space="preserve">Core Technology Stack</w:t>
             </w:r>
           </w:p>
         </w:tc>
@@ -318,7 +318,7 @@
                 <w:sz w:val="19"/>
                 <w:szCs w:val="19"/>
               </w:rPr>
-              <w:t xml:space="preserve">https://github.com/MANAV0060/Smart-Restaurant.git</w:t>
+              <w:t xml:space="preserve">React 18, TypeScript, Vite, Tailwind CSS, Three.js, WebXR, Google Model-Viewer</w:t>
             </w:r>
           </w:p>
         </w:tc>
@@ -352,7 +352,7 @@
                 <w:sz w:val="19"/>
                 <w:szCs w:val="19"/>
               </w:rPr>
-              <w:t xml:space="preserve">Deployment Target</w:t>
+              <w:t xml:space="preserve">Repository</w:t>
             </w:r>
           </w:p>
         </w:tc>
@@ -384,7 +384,7 @@
                 <w:sz w:val="19"/>
                 <w:szCs w:val="19"/>
               </w:rPr>
-              <w:t xml:space="preserve">Vercel Cloud Edge Platform (HTTPS &amp; PWA Enabled)</w:t>
+              <w:t xml:space="preserve">https://github.com/MANAV0060/Smart-Restaurant.git</w:t>
             </w:r>
           </w:p>
         </w:tc>
@@ -418,7 +418,7 @@
                 <w:sz w:val="19"/>
                 <w:szCs w:val="19"/>
               </w:rPr>
-              <w:t xml:space="preserve">Target Devices</w:t>
+              <w:t xml:space="preserve">Deployment Target</w:t>
             </w:r>
           </w:p>
         </w:tc>
@@ -450,7 +450,7 @@
                 <w:sz w:val="19"/>
                 <w:szCs w:val="19"/>
               </w:rPr>
-              <w:t xml:space="preserve">Smartphones (Android Chrome, iOS Safari), Tablets, KDS Wall Displays, Desktop</w:t>
+              <w:t xml:space="preserve">Vercel Cloud Edge Platform (HTTPS &amp; PWA Enabled)</w:t>
             </w:r>
           </w:p>
         </w:tc>
@@ -484,6 +484,72 @@
                 <w:sz w:val="19"/>
                 <w:szCs w:val="19"/>
               </w:rPr>
+              <w:t xml:space="preserve">Target Devices</w:t>
+            </w:r>
+          </w:p>
+        </w:tc>
+        <w:tc>
+          <w:tcPr>
+            <w:tcW w:type="dxa" w:w="6360"/>
+            <w:tcBorders>
+              <w:top w:val="single" w:color="E2E8F0" w:sz="4"/>
+              <w:left w:val="single" w:color="E2E8F0" w:sz="4"/>
+              <w:bottom w:val="single" w:color="E2E8F0" w:sz="4"/>
+              <w:right w:val="single" w:color="E2E8F0" w:sz="4"/>
+            </w:tcBorders>
+            <w:shd w:fill="F8FAFC" w:val="clear"/>
+            <w:tcMar>
+              <w:top w:type="dxa" w:w="100"/>
+              <w:left w:type="dxa" w:w="140"/>
+              <w:bottom w:type="dxa" w:w="100"/>
+              <w:right w:type="dxa" w:w="140"/>
+            </w:tcMar>
+          </w:tcPr>
+          <w:p>
+            <w:pPr>
+              <w:spacing w:after="0" w:line="260"/>
+            </w:pPr>
+            <w:r>
+              <w:rPr>
+                <w:rFonts w:ascii="Calibri" w:cs="Calibri" w:eastAsia="Calibri" w:hAnsi="Calibri"/>
+                <w:color w:val="1C1917"/>
+                <w:sz w:val="19"/>
+                <w:szCs w:val="19"/>
+              </w:rPr>
+              <w:t xml:space="preserve">Smartphones (Android Chrome, iOS Safari), Tablets, KDS Wall Displays, Desktop</w:t>
+            </w:r>
+          </w:p>
+        </w:tc>
+      </w:tr>
+      <w:tr>
+        <w:tc>
+          <w:tcPr>
+            <w:tcW w:type="dxa" w:w="3000"/>
+            <w:tcBorders>
+              <w:top w:val="single" w:color="E2E8F0" w:sz="4"/>
+              <w:left w:val="single" w:color="E2E8F0" w:sz="4"/>
+              <w:bottom w:val="single" w:color="E2E8F0" w:sz="4"/>
+              <w:right w:val="single" w:color="E2E8F0" w:sz="4"/>
+            </w:tcBorders>
+            <w:shd w:fill="FFFFFF" w:val="clear"/>
+            <w:tcMar>
+              <w:top w:type="dxa" w:w="100"/>
+              <w:left w:type="dxa" w:w="140"/>
+              <w:bottom w:type="dxa" w:w="100"/>
+              <w:right w:type="dxa" w:w="140"/>
+            </w:tcMar>
+          </w:tcPr>
+          <w:p>
+            <w:pPr>
+              <w:spacing w:after="0" w:line="260"/>
+            </w:pPr>
+            <w:r>
+              <w:rPr>
+                <w:rFonts w:ascii="Calibri" w:cs="Calibri" w:eastAsia="Calibri" w:hAnsi="Calibri"/>
+                <w:color w:val="1C1917"/>
+                <w:sz w:val="19"/>
+                <w:szCs w:val="19"/>
+              </w:rPr>
               <w:t xml:space="preserve">Architectural Domain</w:t>
             </w:r>
           </w:p>
@@ -497,7 +563,7 @@
               <w:bottom w:val="single" w:color="E2E8F0" w:sz="4"/>
               <w:right w:val="single" w:color="E2E8F0" w:sz="4"/>
             </w:tcBorders>
-            <w:shd w:fill="F8FAFC" w:val="clear"/>
+            <w:shd w:fill="FFFFFF" w:val="clear"/>
             <w:tcMar>
               <w:top w:type="dxa" w:w="100"/>
               <w:left w:type="dxa" w:w="140"/>

</xml_diff>